<commit_message>
UE144: regolamento 2026, termocoperte disattivate (allineato alle gare)
</commit_message>
<xml_diff>
--- a/docs/ue144/ue144_regolamento.docx
+++ b/docs/ue144/ue144_regolamento.docx
@@ -1037,7 +1037,7 @@
           <w:sz w:val="20"/>
           <w:szCs w:val="20"/>
         </w:rPr>
-        <w:t xml:space="preserve">Termocoperte attive per tutte le classi. A disposizione di ogni pilota: 14 pneumatici per round (practice + qualifica + gara), gestiti in totale autonomia — nessun compound imposto oltre a quanto previsto dal BoP LMU della classe.</w:t>
+        <w:t>Termocoperte disattivate per tutte le classi. A disposizione di ogni pilota: 14 pneumatici per round (practice + qualifica + gara), gestiti in totale autonomia — nessun compound imposto oltre a quanto previsto dal BoP LMU della classe.</w:t>
       </w:r>
     </w:p>
     <w:p>
@@ -1063,7 +1063,7 @@
           <w:sz w:val="20"/>
           <w:szCs w:val="20"/>
         </w:rPr>
-        <w:t xml:space="preserve">Termocoperte: attive, nessuna limitazione di utilizzo</w:t>
+        <w:t>Termocoperte: disattivate</w:t>
       </w:r>
     </w:p>
     <w:p>

</xml_diff>

<commit_message>
UE144: rimossi Stop & Go e Drive Through manuale, blue flag informative
</commit_message>
<xml_diff>
--- a/docs/ue144/ue144_regolamento.docx
+++ b/docs/ue144/ue144_regolamento.docx
@@ -1897,7 +1897,7 @@
           <w:sz w:val="20"/>
           <w:szCs w:val="20"/>
         </w:rPr>
-        <w:t xml:space="preserve">Blue flag obbligatorie — vedi Art. 5.3</w:t>
+        <w:t>Blue flag informative: precedenza di traiettoria alle classi più lente — vedi Art. 5.3</w:t>
       </w:r>
     </w:p>
     <w:p>
@@ -2218,27 +2218,6 @@
     </w:p>
     <w:p>
       <w:pPr>
-        <w:pBdr>
-          <w:left w:val="single" w:color="F5A623" w:sz="12" w:space="4"/>
-        </w:pBdr>
-        <w:shd w:fill="FFF8EC" w:val="clear"/>
-        <w:spacing w:after="80" w:before="80"/>
-        <w:ind w:left="288" w:right="288"/>
-      </w:pPr>
-      <w:r>
-        <w:rPr>
-          <w:rFonts w:ascii="Calibri" w:cs="Calibri" w:eastAsia="Calibri" w:hAnsi="Calibri"/>
-          <w:i/>
-          <w:iCs/>
-          <w:color w:val="7A4A00"/>
-          <w:sz w:val="18"/>
-          <w:szCs w:val="18"/>
-        </w:rPr>
-        <w:t xml:space="preserve">⚠  Difendere la posizione contro una vettura di classe superiore che doppia è punibile con Stop &amp; Go 10 secondi.</w:t>
-      </w:r>
-    </w:p>
-    <w:p>
-      <w:pPr>
         <w:pStyle w:val="Heading2"/>
         <w:spacing w:after="80" w:before="240"/>
       </w:pPr>
@@ -2329,7 +2308,7 @@
           <w:sz w:val="20"/>
           <w:szCs w:val="20"/>
         </w:rPr>
-        <w:t xml:space="preserve">Il DT deve essere scontato entro 3 giri dalla notifica in-game, pena penaltà aggiuntiva a discrezione staff</w:t>
+        <w:t>Il DT deve essere scontato entro 3 giri dalla notifica in-game, pena penalità aggiuntiva a discrezione staff</w:t>
       </w:r>
     </w:p>
     <w:p>
@@ -2599,7 +2578,7 @@
                 <w:sz w:val="18"/>
                 <w:szCs w:val="18"/>
               </w:rPr>
-              <w:t xml:space="preserve">Drive Through</w:t>
+              <w:t xml:space="preserve">Penaltà tempo +30s</w:t>
             </w:r>
           </w:p>
         </w:tc>
@@ -2627,7 +2606,7 @@
                 <w:sz w:val="18"/>
                 <w:szCs w:val="18"/>
               </w:rPr>
-              <w:t xml:space="preserve">Entro il lap successivo</w:t>
+              <w:t xml:space="preserve">Post-gara</w:t>
             </w:r>
           </w:p>
         </w:tc>
@@ -2655,7 +2634,7 @@
                 <w:sz w:val="17"/>
                 <w:szCs w:val="17"/>
               </w:rPr>
-              <w:t xml:space="preserve">Contatto evitabile, mancato rispetto blue flag</w:t>
+              <w:t>Contatto evitabile o serio, ostruzione ripetuta, track limits ripetuti</w:t>
             </w:r>
           </w:p>
         </w:tc>
@@ -2686,7 +2665,7 @@
                 <w:sz w:val="18"/>
                 <w:szCs w:val="18"/>
               </w:rPr>
-              <w:t xml:space="preserve">Stop &amp; Go 10s</w:t>
+              <w:t xml:space="preserve">Squalifica (DSQ)</w:t>
             </w:r>
           </w:p>
         </w:tc>
@@ -2714,7 +2693,7 @@
                 <w:sz w:val="18"/>
                 <w:szCs w:val="18"/>
               </w:rPr>
-              <w:t xml:space="preserve">Entro 3 lap</w:t>
+              <w:t xml:space="preserve">Risultato annullato</w:t>
             </w:r>
           </w:p>
         </w:tc>
@@ -2742,7 +2721,7 @@
                 <w:sz w:val="17"/>
                 <w:szCs w:val="17"/>
               </w:rPr>
-              <w:t xml:space="preserve">Contatto serio, ostruzione ripetuta</w:t>
+              <w:t xml:space="preserve">Comportamento antisportivo grave, recidiva</w:t>
             </w:r>
           </w:p>
         </w:tc>
@@ -2772,7 +2751,7 @@
                 <w:sz w:val="18"/>
                 <w:szCs w:val="18"/>
               </w:rPr>
-              <w:t xml:space="preserve">Penaltà tempo +30s</w:t>
+              <w:t xml:space="preserve">Penaltà punti campionato</w:t>
             </w:r>
           </w:p>
         </w:tc>
@@ -2800,7 +2779,7 @@
                 <w:sz w:val="18"/>
                 <w:szCs w:val="18"/>
               </w:rPr>
-              <w:t xml:space="preserve">Post-gara</w:t>
+              <w:t xml:space="preserve">Post-round</w:t>
             </w:r>
           </w:p>
         </w:tc>
@@ -2828,179 +2807,6 @@
                 <w:sz w:val="17"/>
                 <w:szCs w:val="17"/>
               </w:rPr>
-              <w:t xml:space="preserve">Track limits ripetuti, infrazioni post-gara</w:t>
-            </w:r>
-          </w:p>
-        </w:tc>
-      </w:tr>
-      <w:tr>
-        <w:tc>
-          <w:tcPr>
-            <w:tcW w:type="dxa" w:w="2800"/>
-            <w:shd w:fill="E8E8E8" w:val="clear"/>
-            <w:tcMar>
-              <w:top w:type="dxa" w:w="80"/>
-              <w:left w:type="dxa" w:w="120"/>
-              <w:bottom w:type="dxa" w:w="80"/>
-              <w:right w:type="dxa" w:w="120"/>
-            </w:tcMar>
-            <w:vAlign w:val="center"/>
-          </w:tcPr>
-          <w:p>
-            <w:pPr>
-              <w:jc w:val="left"/>
-            </w:pPr>
-            <w:r>
-              <w:rPr>
-                <w:rFonts w:ascii="Calibri" w:cs="Calibri" w:eastAsia="Calibri" w:hAnsi="Calibri"/>
-                <w:b w:val="false"/>
-                <w:bCs w:val="false"/>
-                <w:color w:val="1A1A2E"/>
-                <w:sz w:val="18"/>
-                <w:szCs w:val="18"/>
-              </w:rPr>
-              <w:t xml:space="preserve">Squalifica (DSQ)</w:t>
-            </w:r>
-          </w:p>
-        </w:tc>
-        <w:tc>
-          <w:tcPr>
-            <w:tcW w:type="dxa" w:w="2800"/>
-            <w:tcMar>
-              <w:top w:type="dxa" w:w="80"/>
-              <w:left w:type="dxa" w:w="120"/>
-              <w:bottom w:type="dxa" w:w="80"/>
-              <w:right w:type="dxa" w:w="120"/>
-            </w:tcMar>
-            <w:vAlign w:val="center"/>
-          </w:tcPr>
-          <w:p>
-            <w:pPr>
-              <w:jc w:val="left"/>
-            </w:pPr>
-            <w:r>
-              <w:rPr>
-                <w:rFonts w:ascii="Calibri" w:cs="Calibri" w:eastAsia="Calibri" w:hAnsi="Calibri"/>
-                <w:b w:val="false"/>
-                <w:bCs w:val="false"/>
-                <w:color w:val="1A1A2E"/>
-                <w:sz w:val="18"/>
-                <w:szCs w:val="18"/>
-              </w:rPr>
-              <w:t xml:space="preserve">Risultato annullato</w:t>
-            </w:r>
-          </w:p>
-        </w:tc>
-        <w:tc>
-          <w:tcPr>
-            <w:tcW w:type="dxa" w:w="3472"/>
-            <w:tcMar>
-              <w:top w:type="dxa" w:w="80"/>
-              <w:left w:type="dxa" w:w="120"/>
-              <w:bottom w:type="dxa" w:w="80"/>
-              <w:right w:type="dxa" w:w="120"/>
-            </w:tcMar>
-            <w:vAlign w:val="center"/>
-          </w:tcPr>
-          <w:p>
-            <w:pPr>
-              <w:jc w:val="left"/>
-            </w:pPr>
-            <w:r>
-              <w:rPr>
-                <w:rFonts w:ascii="Calibri" w:cs="Calibri" w:eastAsia="Calibri" w:hAnsi="Calibri"/>
-                <w:b w:val="false"/>
-                <w:bCs w:val="false"/>
-                <w:color w:val="555555"/>
-                <w:sz w:val="17"/>
-                <w:szCs w:val="17"/>
-              </w:rPr>
-              <w:t xml:space="preserve">Comportamento antisportivo grave, recidiva</w:t>
-            </w:r>
-          </w:p>
-        </w:tc>
-      </w:tr>
-      <w:tr>
-        <w:tc>
-          <w:tcPr>
-            <w:tcW w:type="dxa" w:w="2800"/>
-            <w:tcMar>
-              <w:top w:type="dxa" w:w="80"/>
-              <w:left w:type="dxa" w:w="120"/>
-              <w:bottom w:type="dxa" w:w="80"/>
-              <w:right w:type="dxa" w:w="120"/>
-            </w:tcMar>
-            <w:vAlign w:val="center"/>
-          </w:tcPr>
-          <w:p>
-            <w:pPr>
-              <w:jc w:val="left"/>
-            </w:pPr>
-            <w:r>
-              <w:rPr>
-                <w:rFonts w:ascii="Calibri" w:cs="Calibri" w:eastAsia="Calibri" w:hAnsi="Calibri"/>
-                <w:b w:val="false"/>
-                <w:bCs w:val="false"/>
-                <w:color w:val="1A1A2E"/>
-                <w:sz w:val="18"/>
-                <w:szCs w:val="18"/>
-              </w:rPr>
-              <w:t xml:space="preserve">Penaltà punti campionato</w:t>
-            </w:r>
-          </w:p>
-        </w:tc>
-        <w:tc>
-          <w:tcPr>
-            <w:tcW w:type="dxa" w:w="2800"/>
-            <w:tcMar>
-              <w:top w:type="dxa" w:w="80"/>
-              <w:left w:type="dxa" w:w="120"/>
-              <w:bottom w:type="dxa" w:w="80"/>
-              <w:right w:type="dxa" w:w="120"/>
-            </w:tcMar>
-            <w:vAlign w:val="center"/>
-          </w:tcPr>
-          <w:p>
-            <w:pPr>
-              <w:jc w:val="left"/>
-            </w:pPr>
-            <w:r>
-              <w:rPr>
-                <w:rFonts w:ascii="Calibri" w:cs="Calibri" w:eastAsia="Calibri" w:hAnsi="Calibri"/>
-                <w:b w:val="false"/>
-                <w:bCs w:val="false"/>
-                <w:color w:val="1A1A2E"/>
-                <w:sz w:val="18"/>
-                <w:szCs w:val="18"/>
-              </w:rPr>
-              <w:t xml:space="preserve">Post-round</w:t>
-            </w:r>
-          </w:p>
-        </w:tc>
-        <w:tc>
-          <w:tcPr>
-            <w:tcW w:type="dxa" w:w="3472"/>
-            <w:tcMar>
-              <w:top w:type="dxa" w:w="80"/>
-              <w:left w:type="dxa" w:w="120"/>
-              <w:bottom w:type="dxa" w:w="80"/>
-              <w:right w:type="dxa" w:w="120"/>
-            </w:tcMar>
-            <w:vAlign w:val="center"/>
-          </w:tcPr>
-          <w:p>
-            <w:pPr>
-              <w:jc w:val="left"/>
-            </w:pPr>
-            <w:r>
-              <w:rPr>
-                <w:rFonts w:ascii="Calibri" w:cs="Calibri" w:eastAsia="Calibri" w:hAnsi="Calibri"/>
-                <w:b w:val="false"/>
-                <w:bCs w:val="false"/>
-                <w:color w:val="555555"/>
-                <w:sz w:val="17"/>
-                <w:szCs w:val="17"/>
-              </w:rPr>
               <w:t xml:space="preserve">A discrezione staff per infrazioni gravi</w:t>
             </w:r>
           </w:p>
@@ -3078,7 +2884,7 @@
           <w:sz w:val="20"/>
           <w:szCs w:val="20"/>
         </w:rPr>
-        <w:t xml:space="preserve">Penaltà in gara (DT/S&amp;G) da scontare entro i giri indicati pena DSQ</w:t>
+        <w:t>Penalità in gara: solo il Drive-Through automatico LMU per i track limits, da scontare entro 3 giri pena DSQ</w:t>
       </w:r>
     </w:p>
     <w:p>

</xml_diff>

<commit_message>
UE144: reclami solo via modulo con clip obbligatoria, DT non scontato = DSQ, orari server/gara
</commit_message>
<xml_diff>
--- a/docs/ue144/ue144_regolamento.docx
+++ b/docs/ue144/ue144_regolamento.docx
@@ -2308,7 +2308,7 @@
           <w:sz w:val="20"/>
           <w:szCs w:val="20"/>
         </w:rPr>
-        <w:t>Il DT deve essere scontato entro 3 giri dalla notifica in-game, pena penalità aggiuntiva a discrezione staff</w:t>
+        <w:t>Il DT deve essere scontato entro 3 giri dalla notifica in-game, pena squalifica dalla gara</w:t>
       </w:r>
     </w:p>
     <w:p>
@@ -3808,7 +3808,7 @@
           <w:sz w:val="20"/>
           <w:szCs w:val="20"/>
         </w:rPr>
-        <w:t xml:space="preserve">Apertura server: 21:00 (ora reale, per tutti i round). L’orario “Ora in-game” in tabella è l’orologio virtuale del circuito all’avvio della gara, non l’orario reale di connessione — vedi anche la tabella temperature subito dopo il calendario.</w:t>
+        <w:t>Apertura server: 20:30, partenza gara: 21:00 (ora reale, per tutti i round). L’orario “Ora in-game” in tabella è l’orologio virtuale del circuito all’avvio della gara, non l’orario reale di connessione — vedi anche la tabella temperature subito dopo il calendario.</w:t>
       </w:r>
     </w:p>
     <w:p>
@@ -5599,7 +5599,7 @@
           <w:sz w:val="20"/>
           <w:szCs w:val="20"/>
         </w:rPr>
-        <w:t xml:space="preserve">Proteste via apposito canale Discord entro 48 ore dal termine della sessione</w:t>
+        <w:t>Proteste solo tramite il modulo di segnalazione VSD, raggiungibile da Discord e da VSD Paddock, entro 48 ore dal termine della sessione</w:t>
       </w:r>
     </w:p>
     <w:p>

</xml_diff>